<commit_message>
Actualizacion de archivos Unidad 3
</commit_message>
<xml_diff>
--- a/deber6-pseudocodigo-taller10/Formato Tarea SI-1 (2).docx
+++ b/deber6-pseudocodigo-taller10/Formato Tarea SI-1 (2).docx
@@ -1,6 +1,6 @@
 
 <file path=word/document.xml><?xml version="1.0" encoding="utf-8"?>
-<w:document xmlns:wpc="http://schemas.microsoft.com/office/word/2010/wordprocessingCanvas" xmlns:cx="http://schemas.microsoft.com/office/drawing/2014/chartex" xmlns:cx1="http://schemas.microsoft.com/office/drawing/2015/9/8/chartex" xmlns:cx2="http://schemas.microsoft.com/office/drawing/2015/10/21/chartex" xmlns:cx3="http://schemas.microsoft.com/office/drawing/2016/5/9/chartex" xmlns:cx4="http://schemas.microsoft.com/office/drawing/2016/5/10/chartex" xmlns:cx5="http://schemas.microsoft.com/office/drawing/2016/5/11/chartex" xmlns:cx6="http://schemas.microsoft.com/office/drawing/2016/5/12/chartex" xmlns:cx7="http://schemas.microsoft.com/office/drawing/2016/5/13/chartex" xmlns:cx8="http://schemas.microsoft.com/office/drawing/2016/5/14/chartex" xmlns:mc="http://schemas.openxmlformats.org/markup-compatibility/2006" xmlns:aink="http://schemas.microsoft.com/office/drawing/2016/ink" xmlns:am3d="http://schemas.microsoft.com/office/drawing/2017/model3d" xmlns:o="urn:schemas-microsoft-com:office:office" xmlns:oel="http://schemas.microsoft.com/office/2019/extlst" xmlns:r="http://schemas.openxmlformats.org/officeDocument/2006/relationships" xmlns:m="http://schemas.openxmlformats.org/officeDocument/2006/math" xmlns:v="urn:schemas-microsoft-com:vml" xmlns:wp14="http://schemas.microsoft.com/office/word/2010/wordprocessingDrawing" xmlns:wp="http://schemas.openxmlformats.org/drawingml/2006/wordprocessingDrawing" xmlns:w10="urn:schemas-microsoft-com:office:word" xmlns:w="http://schemas.openxmlformats.org/wordprocessingml/2006/main" xmlns:w14="http://schemas.microsoft.com/office/word/2010/wordml" xmlns:w15="http://schemas.microsoft.com/office/word/2012/wordml" xmlns:w16cex="http://schemas.microsoft.com/office/word/2018/wordml/cex" xmlns:w16cid="http://schemas.microsoft.com/office/word/2016/wordml/cid" xmlns:w16="http://schemas.microsoft.com/office/word/2018/wordml" xmlns:w16sdtdh="http://schemas.microsoft.com/office/word/2020/wordml/sdtdatahash" xmlns:w16se="http://schemas.microsoft.com/office/word/2015/wordml/symex" xmlns:wpg="http://schemas.microsoft.com/office/word/2010/wordprocessingGroup" xmlns:wpi="http://schemas.microsoft.com/office/word/2010/wordprocessingInk" xmlns:wne="http://schemas.microsoft.com/office/word/2006/wordml" xmlns:wps="http://schemas.microsoft.com/office/word/2010/wordprocessingShape" mc:Ignorable="w14 w15 w16se w16cid w16 w16cex w16sdtdh wp14">
+<w:document xmlns:wpc="http://schemas.microsoft.com/office/word/2010/wordprocessingCanvas" xmlns:cx="http://schemas.microsoft.com/office/drawing/2014/chartex" xmlns:cx1="http://schemas.microsoft.com/office/drawing/2015/9/8/chartex" xmlns:cx2="http://schemas.microsoft.com/office/drawing/2015/10/21/chartex" xmlns:cx3="http://schemas.microsoft.com/office/drawing/2016/5/9/chartex" xmlns:cx4="http://schemas.microsoft.com/office/drawing/2016/5/10/chartex" xmlns:cx5="http://schemas.microsoft.com/office/drawing/2016/5/11/chartex" xmlns:cx6="http://schemas.microsoft.com/office/drawing/2016/5/12/chartex" xmlns:cx7="http://schemas.microsoft.com/office/drawing/2016/5/13/chartex" xmlns:cx8="http://schemas.microsoft.com/office/drawing/2016/5/14/chartex" xmlns:mc="http://schemas.openxmlformats.org/markup-compatibility/2006" xmlns:aink="http://schemas.microsoft.com/office/drawing/2016/ink" xmlns:am3d="http://schemas.microsoft.com/office/drawing/2017/model3d" xmlns:o="urn:schemas-microsoft-com:office:office" xmlns:oel="http://schemas.microsoft.com/office/2019/extlst" xmlns:r="http://schemas.openxmlformats.org/officeDocument/2006/relationships" xmlns:m="http://schemas.openxmlformats.org/officeDocument/2006/math" xmlns:v="urn:schemas-microsoft-com:vml" xmlns:wp14="http://schemas.microsoft.com/office/word/2010/wordprocessingDrawing" xmlns:wp="http://schemas.openxmlformats.org/drawingml/2006/wordprocessingDrawing" xmlns:w10="urn:schemas-microsoft-com:office:word" xmlns:w="http://schemas.openxmlformats.org/wordprocessingml/2006/main" xmlns:w14="http://schemas.microsoft.com/office/word/2010/wordml" xmlns:w15="http://schemas.microsoft.com/office/word/2012/wordml" xmlns:w16cei="http://schemas.microsoft.com/office/word/2026/wordml/cei" xmlns:w16cex="http://schemas.microsoft.com/office/word/2018/wordml/cex" xmlns:w16cid="http://schemas.microsoft.com/office/word/2016/wordml/cid" xmlns:w16="http://schemas.microsoft.com/office/word/2018/wordml" xmlns:w16du="http://schemas.microsoft.com/office/word/2023/wordml/word16du" xmlns:w16sdtdh="http://schemas.microsoft.com/office/word/2020/wordml/sdtdatahash" xmlns:w16sdtfl="http://schemas.microsoft.com/office/word/2024/wordml/sdtformatlock" xmlns:w16se="http://schemas.microsoft.com/office/word/2015/wordml/symex" xmlns:wpg="http://schemas.microsoft.com/office/word/2010/wordprocessingGroup" xmlns:wpi="http://schemas.microsoft.com/office/word/2010/wordprocessingInk" xmlns:wne="http://schemas.microsoft.com/office/word/2006/wordml" xmlns:wps="http://schemas.microsoft.com/office/word/2010/wordprocessingShape" mc:Ignorable="w14 w15 w16se w16cid w16 w16cex w16sdtdh w16sdtfl w16du wp14">
   <w:body>
     <w:tbl>
       <w:tblPr>
@@ -488,7 +488,13 @@
               <w:rPr>
                 <w:bCs/>
               </w:rPr>
-              <w:t xml:space="preserve">Dylan Santillan  </w:t>
+              <w:t>Rodrigo Andrade</w:t>
+            </w:r>
+            <w:r>
+              <w:rPr>
+                <w:bCs/>
+              </w:rPr>
+              <w:t xml:space="preserve">  </w:t>
             </w:r>
           </w:p>
         </w:tc>
@@ -10257,7 +10263,7 @@
 </file>
 
 <file path=word/endnotes.xml><?xml version="1.0" encoding="utf-8"?>
-<w:endnotes xmlns:wpc="http://schemas.microsoft.com/office/word/2010/wordprocessingCanvas" xmlns:cx="http://schemas.microsoft.com/office/drawing/2014/chartex" xmlns:cx1="http://schemas.microsoft.com/office/drawing/2015/9/8/chartex" xmlns:cx2="http://schemas.microsoft.com/office/drawing/2015/10/21/chartex" xmlns:cx3="http://schemas.microsoft.com/office/drawing/2016/5/9/chartex" xmlns:cx4="http://schemas.microsoft.com/office/drawing/2016/5/10/chartex" xmlns:cx5="http://schemas.microsoft.com/office/drawing/2016/5/11/chartex" xmlns:cx6="http://schemas.microsoft.com/office/drawing/2016/5/12/chartex" xmlns:cx7="http://schemas.microsoft.com/office/drawing/2016/5/13/chartex" xmlns:cx8="http://schemas.microsoft.com/office/drawing/2016/5/14/chartex" xmlns:mc="http://schemas.openxmlformats.org/markup-compatibility/2006" xmlns:aink="http://schemas.microsoft.com/office/drawing/2016/ink" xmlns:am3d="http://schemas.microsoft.com/office/drawing/2017/model3d" xmlns:o="urn:schemas-microsoft-com:office:office" xmlns:oel="http://schemas.microsoft.com/office/2019/extlst" xmlns:r="http://schemas.openxmlformats.org/officeDocument/2006/relationships" xmlns:m="http://schemas.openxmlformats.org/officeDocument/2006/math" xmlns:v="urn:schemas-microsoft-com:vml" xmlns:wp14="http://schemas.microsoft.com/office/word/2010/wordprocessingDrawing" xmlns:wp="http://schemas.openxmlformats.org/drawingml/2006/wordprocessingDrawing" xmlns:w10="urn:schemas-microsoft-com:office:word" xmlns:w="http://schemas.openxmlformats.org/wordprocessingml/2006/main" xmlns:w14="http://schemas.microsoft.com/office/word/2010/wordml" xmlns:w15="http://schemas.microsoft.com/office/word/2012/wordml" xmlns:w16cex="http://schemas.microsoft.com/office/word/2018/wordml/cex" xmlns:w16cid="http://schemas.microsoft.com/office/word/2016/wordml/cid" xmlns:w16="http://schemas.microsoft.com/office/word/2018/wordml" xmlns:w16sdtdh="http://schemas.microsoft.com/office/word/2020/wordml/sdtdatahash" xmlns:w16se="http://schemas.microsoft.com/office/word/2015/wordml/symex" xmlns:wpg="http://schemas.microsoft.com/office/word/2010/wordprocessingGroup" xmlns:wpi="http://schemas.microsoft.com/office/word/2010/wordprocessingInk" xmlns:wne="http://schemas.microsoft.com/office/word/2006/wordml" xmlns:wps="http://schemas.microsoft.com/office/word/2010/wordprocessingShape" mc:Ignorable="w14 w15 w16se w16cid w16 w16cex w16sdtdh wp14">
+<w:endnotes xmlns:wpc="http://schemas.microsoft.com/office/word/2010/wordprocessingCanvas" xmlns:cx="http://schemas.microsoft.com/office/drawing/2014/chartex" xmlns:cx1="http://schemas.microsoft.com/office/drawing/2015/9/8/chartex" xmlns:cx2="http://schemas.microsoft.com/office/drawing/2015/10/21/chartex" xmlns:cx3="http://schemas.microsoft.com/office/drawing/2016/5/9/chartex" xmlns:cx4="http://schemas.microsoft.com/office/drawing/2016/5/10/chartex" xmlns:cx5="http://schemas.microsoft.com/office/drawing/2016/5/11/chartex" xmlns:cx6="http://schemas.microsoft.com/office/drawing/2016/5/12/chartex" xmlns:cx7="http://schemas.microsoft.com/office/drawing/2016/5/13/chartex" xmlns:cx8="http://schemas.microsoft.com/office/drawing/2016/5/14/chartex" xmlns:mc="http://schemas.openxmlformats.org/markup-compatibility/2006" xmlns:aink="http://schemas.microsoft.com/office/drawing/2016/ink" xmlns:am3d="http://schemas.microsoft.com/office/drawing/2017/model3d" xmlns:o="urn:schemas-microsoft-com:office:office" xmlns:oel="http://schemas.microsoft.com/office/2019/extlst" xmlns:r="http://schemas.openxmlformats.org/officeDocument/2006/relationships" xmlns:m="http://schemas.openxmlformats.org/officeDocument/2006/math" xmlns:v="urn:schemas-microsoft-com:vml" xmlns:wp14="http://schemas.microsoft.com/office/word/2010/wordprocessingDrawing" xmlns:wp="http://schemas.openxmlformats.org/drawingml/2006/wordprocessingDrawing" xmlns:w10="urn:schemas-microsoft-com:office:word" xmlns:w="http://schemas.openxmlformats.org/wordprocessingml/2006/main" xmlns:w14="http://schemas.microsoft.com/office/word/2010/wordml" xmlns:w15="http://schemas.microsoft.com/office/word/2012/wordml" xmlns:w16cei="http://schemas.microsoft.com/office/word/2026/wordml/cei" xmlns:w16cex="http://schemas.microsoft.com/office/word/2018/wordml/cex" xmlns:w16cid="http://schemas.microsoft.com/office/word/2016/wordml/cid" xmlns:w16="http://schemas.microsoft.com/office/word/2018/wordml" xmlns:w16du="http://schemas.microsoft.com/office/word/2023/wordml/word16du" xmlns:w16sdtdh="http://schemas.microsoft.com/office/word/2020/wordml/sdtdatahash" xmlns:w16sdtfl="http://schemas.microsoft.com/office/word/2024/wordml/sdtformatlock" xmlns:w16se="http://schemas.microsoft.com/office/word/2015/wordml/symex" xmlns:wpg="http://schemas.microsoft.com/office/word/2010/wordprocessingGroup" xmlns:wpi="http://schemas.microsoft.com/office/word/2010/wordprocessingInk" xmlns:wne="http://schemas.microsoft.com/office/word/2006/wordml" xmlns:wps="http://schemas.microsoft.com/office/word/2010/wordprocessingShape" mc:Ignorable="w14 w15 w16se w16cid w16 w16cex w16sdtdh w16sdtfl w16du wp14">
   <w:endnote w:type="separator" w:id="-1">
     <w:p>
       <w:pPr>
@@ -10282,7 +10288,7 @@
 </file>
 
 <file path=word/footnotes.xml><?xml version="1.0" encoding="utf-8"?>
-<w:footnotes xmlns:wpc="http://schemas.microsoft.com/office/word/2010/wordprocessingCanvas" xmlns:cx="http://schemas.microsoft.com/office/drawing/2014/chartex" xmlns:cx1="http://schemas.microsoft.com/office/drawing/2015/9/8/chartex" xmlns:cx2="http://schemas.microsoft.com/office/drawing/2015/10/21/chartex" xmlns:cx3="http://schemas.microsoft.com/office/drawing/2016/5/9/chartex" xmlns:cx4="http://schemas.microsoft.com/office/drawing/2016/5/10/chartex" xmlns:cx5="http://schemas.microsoft.com/office/drawing/2016/5/11/chartex" xmlns:cx6="http://schemas.microsoft.com/office/drawing/2016/5/12/chartex" xmlns:cx7="http://schemas.microsoft.com/office/drawing/2016/5/13/chartex" xmlns:cx8="http://schemas.microsoft.com/office/drawing/2016/5/14/chartex" xmlns:mc="http://schemas.openxmlformats.org/markup-compatibility/2006" xmlns:aink="http://schemas.microsoft.com/office/drawing/2016/ink" xmlns:am3d="http://schemas.microsoft.com/office/drawing/2017/model3d" xmlns:o="urn:schemas-microsoft-com:office:office" xmlns:oel="http://schemas.microsoft.com/office/2019/extlst" xmlns:r="http://schemas.openxmlformats.org/officeDocument/2006/relationships" xmlns:m="http://schemas.openxmlformats.org/officeDocument/2006/math" xmlns:v="urn:schemas-microsoft-com:vml" xmlns:wp14="http://schemas.microsoft.com/office/word/2010/wordprocessingDrawing" xmlns:wp="http://schemas.openxmlformats.org/drawingml/2006/wordprocessingDrawing" xmlns:w10="urn:schemas-microsoft-com:office:word" xmlns:w="http://schemas.openxmlformats.org/wordprocessingml/2006/main" xmlns:w14="http://schemas.microsoft.com/office/word/2010/wordml" xmlns:w15="http://schemas.microsoft.com/office/word/2012/wordml" xmlns:w16cex="http://schemas.microsoft.com/office/word/2018/wordml/cex" xmlns:w16cid="http://schemas.microsoft.com/office/word/2016/wordml/cid" xmlns:w16="http://schemas.microsoft.com/office/word/2018/wordml" xmlns:w16sdtdh="http://schemas.microsoft.com/office/word/2020/wordml/sdtdatahash" xmlns:w16se="http://schemas.microsoft.com/office/word/2015/wordml/symex" xmlns:wpg="http://schemas.microsoft.com/office/word/2010/wordprocessingGroup" xmlns:wpi="http://schemas.microsoft.com/office/word/2010/wordprocessingInk" xmlns:wne="http://schemas.microsoft.com/office/word/2006/wordml" xmlns:wps="http://schemas.microsoft.com/office/word/2010/wordprocessingShape" mc:Ignorable="w14 w15 w16se w16cid w16 w16cex w16sdtdh wp14">
+<w:footnotes xmlns:wpc="http://schemas.microsoft.com/office/word/2010/wordprocessingCanvas" xmlns:cx="http://schemas.microsoft.com/office/drawing/2014/chartex" xmlns:cx1="http://schemas.microsoft.com/office/drawing/2015/9/8/chartex" xmlns:cx2="http://schemas.microsoft.com/office/drawing/2015/10/21/chartex" xmlns:cx3="http://schemas.microsoft.com/office/drawing/2016/5/9/chartex" xmlns:cx4="http://schemas.microsoft.com/office/drawing/2016/5/10/chartex" xmlns:cx5="http://schemas.microsoft.com/office/drawing/2016/5/11/chartex" xmlns:cx6="http://schemas.microsoft.com/office/drawing/2016/5/12/chartex" xmlns:cx7="http://schemas.microsoft.com/office/drawing/2016/5/13/chartex" xmlns:cx8="http://schemas.microsoft.com/office/drawing/2016/5/14/chartex" xmlns:mc="http://schemas.openxmlformats.org/markup-compatibility/2006" xmlns:aink="http://schemas.microsoft.com/office/drawing/2016/ink" xmlns:am3d="http://schemas.microsoft.com/office/drawing/2017/model3d" xmlns:o="urn:schemas-microsoft-com:office:office" xmlns:oel="http://schemas.microsoft.com/office/2019/extlst" xmlns:r="http://schemas.openxmlformats.org/officeDocument/2006/relationships" xmlns:m="http://schemas.openxmlformats.org/officeDocument/2006/math" xmlns:v="urn:schemas-microsoft-com:vml" xmlns:wp14="http://schemas.microsoft.com/office/word/2010/wordprocessingDrawing" xmlns:wp="http://schemas.openxmlformats.org/drawingml/2006/wordprocessingDrawing" xmlns:w10="urn:schemas-microsoft-com:office:word" xmlns:w="http://schemas.openxmlformats.org/wordprocessingml/2006/main" xmlns:w14="http://schemas.microsoft.com/office/word/2010/wordml" xmlns:w15="http://schemas.microsoft.com/office/word/2012/wordml" xmlns:w16cei="http://schemas.microsoft.com/office/word/2026/wordml/cei" xmlns:w16cex="http://schemas.microsoft.com/office/word/2018/wordml/cex" xmlns:w16cid="http://schemas.microsoft.com/office/word/2016/wordml/cid" xmlns:w16="http://schemas.microsoft.com/office/word/2018/wordml" xmlns:w16du="http://schemas.microsoft.com/office/word/2023/wordml/word16du" xmlns:w16sdtdh="http://schemas.microsoft.com/office/word/2020/wordml/sdtdatahash" xmlns:w16sdtfl="http://schemas.microsoft.com/office/word/2024/wordml/sdtformatlock" xmlns:w16se="http://schemas.microsoft.com/office/word/2015/wordml/symex" xmlns:wpg="http://schemas.microsoft.com/office/word/2010/wordprocessingGroup" xmlns:wpi="http://schemas.microsoft.com/office/word/2010/wordprocessingInk" xmlns:wne="http://schemas.microsoft.com/office/word/2006/wordml" xmlns:wps="http://schemas.microsoft.com/office/word/2010/wordprocessingShape" mc:Ignorable="w14 w15 w16se w16cid w16 w16cex w16sdtdh w16sdtfl w16du wp14">
   <w:footnote w:type="separator" w:id="-1">
     <w:p>
       <w:pPr>
@@ -10307,7 +10313,7 @@
 </file>
 
 <file path=word/header1.xml><?xml version="1.0" encoding="utf-8"?>
-<w:hdr xmlns:wpc="http://schemas.microsoft.com/office/word/2010/wordprocessingCanvas" xmlns:cx="http://schemas.microsoft.com/office/drawing/2014/chartex" xmlns:cx1="http://schemas.microsoft.com/office/drawing/2015/9/8/chartex" xmlns:cx2="http://schemas.microsoft.com/office/drawing/2015/10/21/chartex" xmlns:cx3="http://schemas.microsoft.com/office/drawing/2016/5/9/chartex" xmlns:cx4="http://schemas.microsoft.com/office/drawing/2016/5/10/chartex" xmlns:cx5="http://schemas.microsoft.com/office/drawing/2016/5/11/chartex" xmlns:cx6="http://schemas.microsoft.com/office/drawing/2016/5/12/chartex" xmlns:cx7="http://schemas.microsoft.com/office/drawing/2016/5/13/chartex" xmlns:cx8="http://schemas.microsoft.com/office/drawing/2016/5/14/chartex" xmlns:mc="http://schemas.openxmlformats.org/markup-compatibility/2006" xmlns:aink="http://schemas.microsoft.com/office/drawing/2016/ink" xmlns:am3d="http://schemas.microsoft.com/office/drawing/2017/model3d" xmlns:o="urn:schemas-microsoft-com:office:office" xmlns:oel="http://schemas.microsoft.com/office/2019/extlst" xmlns:r="http://schemas.openxmlformats.org/officeDocument/2006/relationships" xmlns:m="http://schemas.openxmlformats.org/officeDocument/2006/math" xmlns:v="urn:schemas-microsoft-com:vml" xmlns:wp14="http://schemas.microsoft.com/office/word/2010/wordprocessingDrawing" xmlns:wp="http://schemas.openxmlformats.org/drawingml/2006/wordprocessingDrawing" xmlns:w10="urn:schemas-microsoft-com:office:word" xmlns:w="http://schemas.openxmlformats.org/wordprocessingml/2006/main" xmlns:w14="http://schemas.microsoft.com/office/word/2010/wordml" xmlns:w15="http://schemas.microsoft.com/office/word/2012/wordml" xmlns:w16cex="http://schemas.microsoft.com/office/word/2018/wordml/cex" xmlns:w16cid="http://schemas.microsoft.com/office/word/2016/wordml/cid" xmlns:w16="http://schemas.microsoft.com/office/word/2018/wordml" xmlns:w16sdtdh="http://schemas.microsoft.com/office/word/2020/wordml/sdtdatahash" xmlns:w16se="http://schemas.microsoft.com/office/word/2015/wordml/symex" xmlns:wpg="http://schemas.microsoft.com/office/word/2010/wordprocessingGroup" xmlns:wpi="http://schemas.microsoft.com/office/word/2010/wordprocessingInk" xmlns:wne="http://schemas.microsoft.com/office/word/2006/wordml" xmlns:wps="http://schemas.microsoft.com/office/word/2010/wordprocessingShape" mc:Ignorable="w14 w15 w16se w16cid w16 w16cex w16sdtdh wp14">
+<w:hdr xmlns:wpc="http://schemas.microsoft.com/office/word/2010/wordprocessingCanvas" xmlns:cx="http://schemas.microsoft.com/office/drawing/2014/chartex" xmlns:cx1="http://schemas.microsoft.com/office/drawing/2015/9/8/chartex" xmlns:cx2="http://schemas.microsoft.com/office/drawing/2015/10/21/chartex" xmlns:cx3="http://schemas.microsoft.com/office/drawing/2016/5/9/chartex" xmlns:cx4="http://schemas.microsoft.com/office/drawing/2016/5/10/chartex" xmlns:cx5="http://schemas.microsoft.com/office/drawing/2016/5/11/chartex" xmlns:cx6="http://schemas.microsoft.com/office/drawing/2016/5/12/chartex" xmlns:cx7="http://schemas.microsoft.com/office/drawing/2016/5/13/chartex" xmlns:cx8="http://schemas.microsoft.com/office/drawing/2016/5/14/chartex" xmlns:mc="http://schemas.openxmlformats.org/markup-compatibility/2006" xmlns:aink="http://schemas.microsoft.com/office/drawing/2016/ink" xmlns:am3d="http://schemas.microsoft.com/office/drawing/2017/model3d" xmlns:o="urn:schemas-microsoft-com:office:office" xmlns:oel="http://schemas.microsoft.com/office/2019/extlst" xmlns:r="http://schemas.openxmlformats.org/officeDocument/2006/relationships" xmlns:m="http://schemas.openxmlformats.org/officeDocument/2006/math" xmlns:v="urn:schemas-microsoft-com:vml" xmlns:wp14="http://schemas.microsoft.com/office/word/2010/wordprocessingDrawing" xmlns:wp="http://schemas.openxmlformats.org/drawingml/2006/wordprocessingDrawing" xmlns:w10="urn:schemas-microsoft-com:office:word" xmlns:w="http://schemas.openxmlformats.org/wordprocessingml/2006/main" xmlns:w14="http://schemas.microsoft.com/office/word/2010/wordml" xmlns:w15="http://schemas.microsoft.com/office/word/2012/wordml" xmlns:w16cei="http://schemas.microsoft.com/office/word/2026/wordml/cei" xmlns:w16cex="http://schemas.microsoft.com/office/word/2018/wordml/cex" xmlns:w16cid="http://schemas.microsoft.com/office/word/2016/wordml/cid" xmlns:w16="http://schemas.microsoft.com/office/word/2018/wordml" xmlns:w16du="http://schemas.microsoft.com/office/word/2023/wordml/word16du" xmlns:w16sdtdh="http://schemas.microsoft.com/office/word/2020/wordml/sdtdatahash" xmlns:w16sdtfl="http://schemas.microsoft.com/office/word/2024/wordml/sdtformatlock" xmlns:w16se="http://schemas.microsoft.com/office/word/2015/wordml/symex" xmlns:wpg="http://schemas.microsoft.com/office/word/2010/wordprocessingGroup" xmlns:wpi="http://schemas.microsoft.com/office/word/2010/wordprocessingInk" xmlns:wne="http://schemas.microsoft.com/office/word/2006/wordml" xmlns:wps="http://schemas.microsoft.com/office/word/2010/wordprocessingShape" mc:Ignorable="w14 w15 w16se w16cid w16 w16cex w16sdtdh w16sdtfl w16du wp14">
   <w:p>
     <w:pPr>
       <w:pStyle w:val="Encabezado"/>
@@ -10377,7 +10383,7 @@
 </file>
 
 <file path=word/numbering.xml><?xml version="1.0" encoding="utf-8"?>
-<w:numbering xmlns:wpc="http://schemas.microsoft.com/office/word/2010/wordprocessingCanvas" xmlns:cx="http://schemas.microsoft.com/office/drawing/2014/chartex" xmlns:cx1="http://schemas.microsoft.com/office/drawing/2015/9/8/chartex" xmlns:cx2="http://schemas.microsoft.com/office/drawing/2015/10/21/chartex" xmlns:cx3="http://schemas.microsoft.com/office/drawing/2016/5/9/chartex" xmlns:cx4="http://schemas.microsoft.com/office/drawing/2016/5/10/chartex" xmlns:cx5="http://schemas.microsoft.com/office/drawing/2016/5/11/chartex" xmlns:cx6="http://schemas.microsoft.com/office/drawing/2016/5/12/chartex" xmlns:cx7="http://schemas.microsoft.com/office/drawing/2016/5/13/chartex" xmlns:cx8="http://schemas.microsoft.com/office/drawing/2016/5/14/chartex" xmlns:mc="http://schemas.openxmlformats.org/markup-compatibility/2006" xmlns:aink="http://schemas.microsoft.com/office/drawing/2016/ink" xmlns:am3d="http://schemas.microsoft.com/office/drawing/2017/model3d" xmlns:o="urn:schemas-microsoft-com:office:office" xmlns:oel="http://schemas.microsoft.com/office/2019/extlst" xmlns:r="http://schemas.openxmlformats.org/officeDocument/2006/relationships" xmlns:m="http://schemas.openxmlformats.org/officeDocument/2006/math" xmlns:v="urn:schemas-microsoft-com:vml" xmlns:wp14="http://schemas.microsoft.com/office/word/2010/wordprocessingDrawing" xmlns:wp="http://schemas.openxmlformats.org/drawingml/2006/wordprocessingDrawing" xmlns:w10="urn:schemas-microsoft-com:office:word" xmlns:w="http://schemas.openxmlformats.org/wordprocessingml/2006/main" xmlns:w14="http://schemas.microsoft.com/office/word/2010/wordml" xmlns:w15="http://schemas.microsoft.com/office/word/2012/wordml" xmlns:w16cex="http://schemas.microsoft.com/office/word/2018/wordml/cex" xmlns:w16cid="http://schemas.microsoft.com/office/word/2016/wordml/cid" xmlns:w16="http://schemas.microsoft.com/office/word/2018/wordml" xmlns:w16sdtdh="http://schemas.microsoft.com/office/word/2020/wordml/sdtdatahash" xmlns:w16se="http://schemas.microsoft.com/office/word/2015/wordml/symex" xmlns:wpg="http://schemas.microsoft.com/office/word/2010/wordprocessingGroup" xmlns:wpi="http://schemas.microsoft.com/office/word/2010/wordprocessingInk" xmlns:wne="http://schemas.microsoft.com/office/word/2006/wordml" xmlns:wps="http://schemas.microsoft.com/office/word/2010/wordprocessingShape" mc:Ignorable="w14 w15 w16se w16cid w16 w16cex w16sdtdh wp14">
+<w:numbering xmlns:wpc="http://schemas.microsoft.com/office/word/2010/wordprocessingCanvas" xmlns:cx="http://schemas.microsoft.com/office/drawing/2014/chartex" xmlns:cx1="http://schemas.microsoft.com/office/drawing/2015/9/8/chartex" xmlns:cx2="http://schemas.microsoft.com/office/drawing/2015/10/21/chartex" xmlns:cx3="http://schemas.microsoft.com/office/drawing/2016/5/9/chartex" xmlns:cx4="http://schemas.microsoft.com/office/drawing/2016/5/10/chartex" xmlns:cx5="http://schemas.microsoft.com/office/drawing/2016/5/11/chartex" xmlns:cx6="http://schemas.microsoft.com/office/drawing/2016/5/12/chartex" xmlns:cx7="http://schemas.microsoft.com/office/drawing/2016/5/13/chartex" xmlns:cx8="http://schemas.microsoft.com/office/drawing/2016/5/14/chartex" xmlns:mc="http://schemas.openxmlformats.org/markup-compatibility/2006" xmlns:aink="http://schemas.microsoft.com/office/drawing/2016/ink" xmlns:am3d="http://schemas.microsoft.com/office/drawing/2017/model3d" xmlns:o="urn:schemas-microsoft-com:office:office" xmlns:oel="http://schemas.microsoft.com/office/2019/extlst" xmlns:r="http://schemas.openxmlformats.org/officeDocument/2006/relationships" xmlns:m="http://schemas.openxmlformats.org/officeDocument/2006/math" xmlns:v="urn:schemas-microsoft-com:vml" xmlns:wp14="http://schemas.microsoft.com/office/word/2010/wordprocessingDrawing" xmlns:wp="http://schemas.openxmlformats.org/drawingml/2006/wordprocessingDrawing" xmlns:w10="urn:schemas-microsoft-com:office:word" xmlns:w="http://schemas.openxmlformats.org/wordprocessingml/2006/main" xmlns:w14="http://schemas.microsoft.com/office/word/2010/wordml" xmlns:w15="http://schemas.microsoft.com/office/word/2012/wordml" xmlns:w16cei="http://schemas.microsoft.com/office/word/2026/wordml/cei" xmlns:w16cex="http://schemas.microsoft.com/office/word/2018/wordml/cex" xmlns:w16cid="http://schemas.microsoft.com/office/word/2016/wordml/cid" xmlns:w16="http://schemas.microsoft.com/office/word/2018/wordml" xmlns:w16du="http://schemas.microsoft.com/office/word/2023/wordml/word16du" xmlns:w16sdtdh="http://schemas.microsoft.com/office/word/2020/wordml/sdtdatahash" xmlns:w16sdtfl="http://schemas.microsoft.com/office/word/2024/wordml/sdtformatlock" xmlns:w16se="http://schemas.microsoft.com/office/word/2015/wordml/symex" xmlns:wpg="http://schemas.microsoft.com/office/word/2010/wordprocessingGroup" xmlns:wpi="http://schemas.microsoft.com/office/word/2010/wordprocessingInk" xmlns:wne="http://schemas.microsoft.com/office/word/2006/wordml" xmlns:wps="http://schemas.microsoft.com/office/word/2010/wordprocessingShape" mc:Ignorable="w14 w15 w16se w16cid w16 w16cex w16sdtdh w16sdtfl w16du wp14">
   <w:abstractNum w:abstractNumId="0" w15:restartNumberingAfterBreak="0">
     <w:nsid w:val="09581F79"/>
     <w:multiLevelType w:val="multilevel"/>
@@ -12190,7 +12196,7 @@
 </file>
 
 <file path=word/styles.xml><?xml version="1.0" encoding="utf-8"?>
-<w:styles xmlns:mc="http://schemas.openxmlformats.org/markup-compatibility/2006" xmlns:r="http://schemas.openxmlformats.org/officeDocument/2006/relationships" xmlns:w="http://schemas.openxmlformats.org/wordprocessingml/2006/main" xmlns:w14="http://schemas.microsoft.com/office/word/2010/wordml" xmlns:w15="http://schemas.microsoft.com/office/word/2012/wordml" xmlns:w16cex="http://schemas.microsoft.com/office/word/2018/wordml/cex" xmlns:w16cid="http://schemas.microsoft.com/office/word/2016/wordml/cid" xmlns:w16="http://schemas.microsoft.com/office/word/2018/wordml" xmlns:w16sdtdh="http://schemas.microsoft.com/office/word/2020/wordml/sdtdatahash" xmlns:w16se="http://schemas.microsoft.com/office/word/2015/wordml/symex" mc:Ignorable="w14 w15 w16se w16cid w16 w16cex w16sdtdh">
+<w:styles xmlns:mc="http://schemas.openxmlformats.org/markup-compatibility/2006" xmlns:r="http://schemas.openxmlformats.org/officeDocument/2006/relationships" xmlns:w="http://schemas.openxmlformats.org/wordprocessingml/2006/main" xmlns:w14="http://schemas.microsoft.com/office/word/2010/wordml" xmlns:w15="http://schemas.microsoft.com/office/word/2012/wordml" xmlns:w16cex="http://schemas.microsoft.com/office/word/2018/wordml/cex" xmlns:w16cid="http://schemas.microsoft.com/office/word/2016/wordml/cid" xmlns:w16="http://schemas.microsoft.com/office/word/2018/wordml" xmlns:w16du="http://schemas.microsoft.com/office/word/2023/wordml/word16du" xmlns:w16sdtdh="http://schemas.microsoft.com/office/word/2020/wordml/sdtdatahash" xmlns:w16sdtfl="http://schemas.microsoft.com/office/word/2024/wordml/sdtformatlock" xmlns:w16se="http://schemas.microsoft.com/office/word/2015/wordml/symex" mc:Ignorable="w14 w15 w16se w16cid w16 w16cex w16sdtdh w16sdtfl w16du">
   <w:docDefaults>
     <w:rPrDefault>
       <w:rPr>
@@ -12822,6 +12828,7 @@
   <w:style w:type="character" w:default="1" w:styleId="Fuentedeprrafopredeter">
     <w:name w:val="Default Paragraph Font"/>
     <w:uiPriority w:val="1"/>
+    <w:semiHidden/>
     <w:unhideWhenUsed/>
   </w:style>
   <w:style w:type="table" w:default="1" w:styleId="Tablanormal">
@@ -13317,7 +13324,7 @@
 </file>
 
 <file path=word/glossary/document.xml><?xml version="1.0" encoding="utf-8"?>
-<w:glossaryDocument xmlns:wpc="http://schemas.microsoft.com/office/word/2010/wordprocessingCanvas" xmlns:cx="http://schemas.microsoft.com/office/drawing/2014/chartex" xmlns:cx1="http://schemas.microsoft.com/office/drawing/2015/9/8/chartex" xmlns:cx2="http://schemas.microsoft.com/office/drawing/2015/10/21/chartex" xmlns:cx3="http://schemas.microsoft.com/office/drawing/2016/5/9/chartex" xmlns:cx4="http://schemas.microsoft.com/office/drawing/2016/5/10/chartex" xmlns:cx5="http://schemas.microsoft.com/office/drawing/2016/5/11/chartex" xmlns:cx6="http://schemas.microsoft.com/office/drawing/2016/5/12/chartex" xmlns:cx7="http://schemas.microsoft.com/office/drawing/2016/5/13/chartex" xmlns:cx8="http://schemas.microsoft.com/office/drawing/2016/5/14/chartex" xmlns:mc="http://schemas.openxmlformats.org/markup-compatibility/2006" xmlns:aink="http://schemas.microsoft.com/office/drawing/2016/ink" xmlns:am3d="http://schemas.microsoft.com/office/drawing/2017/model3d" xmlns:o="urn:schemas-microsoft-com:office:office" xmlns:oel="http://schemas.microsoft.com/office/2019/extlst" xmlns:r="http://schemas.openxmlformats.org/officeDocument/2006/relationships" xmlns:m="http://schemas.openxmlformats.org/officeDocument/2006/math" xmlns:v="urn:schemas-microsoft-com:vml" xmlns:wp14="http://schemas.microsoft.com/office/word/2010/wordprocessingDrawing" xmlns:wp="http://schemas.openxmlformats.org/drawingml/2006/wordprocessingDrawing" xmlns:w10="urn:schemas-microsoft-com:office:word" xmlns:w="http://schemas.openxmlformats.org/wordprocessingml/2006/main" xmlns:w14="http://schemas.microsoft.com/office/word/2010/wordml" xmlns:w15="http://schemas.microsoft.com/office/word/2012/wordml" xmlns:w16cex="http://schemas.microsoft.com/office/word/2018/wordml/cex" xmlns:w16cid="http://schemas.microsoft.com/office/word/2016/wordml/cid" xmlns:w16="http://schemas.microsoft.com/office/word/2018/wordml" xmlns:w16sdtdh="http://schemas.microsoft.com/office/word/2020/wordml/sdtdatahash" xmlns:w16se="http://schemas.microsoft.com/office/word/2015/wordml/symex" xmlns:wpg="http://schemas.microsoft.com/office/word/2010/wordprocessingGroup" xmlns:wpi="http://schemas.microsoft.com/office/word/2010/wordprocessingInk" xmlns:wne="http://schemas.microsoft.com/office/word/2006/wordml" xmlns:wps="http://schemas.microsoft.com/office/word/2010/wordprocessingShape" mc:Ignorable="w14 w15 w16se w16cid w16 w16cex w16sdtdh wp14">
+<w:glossaryDocument xmlns:wpc="http://schemas.microsoft.com/office/word/2010/wordprocessingCanvas" xmlns:cx="http://schemas.microsoft.com/office/drawing/2014/chartex" xmlns:cx1="http://schemas.microsoft.com/office/drawing/2015/9/8/chartex" xmlns:cx2="http://schemas.microsoft.com/office/drawing/2015/10/21/chartex" xmlns:cx3="http://schemas.microsoft.com/office/drawing/2016/5/9/chartex" xmlns:cx4="http://schemas.microsoft.com/office/drawing/2016/5/10/chartex" xmlns:cx5="http://schemas.microsoft.com/office/drawing/2016/5/11/chartex" xmlns:cx6="http://schemas.microsoft.com/office/drawing/2016/5/12/chartex" xmlns:cx7="http://schemas.microsoft.com/office/drawing/2016/5/13/chartex" xmlns:cx8="http://schemas.microsoft.com/office/drawing/2016/5/14/chartex" xmlns:mc="http://schemas.openxmlformats.org/markup-compatibility/2006" xmlns:aink="http://schemas.microsoft.com/office/drawing/2016/ink" xmlns:am3d="http://schemas.microsoft.com/office/drawing/2017/model3d" xmlns:o="urn:schemas-microsoft-com:office:office" xmlns:oel="http://schemas.microsoft.com/office/2019/extlst" xmlns:r="http://schemas.openxmlformats.org/officeDocument/2006/relationships" xmlns:m="http://schemas.openxmlformats.org/officeDocument/2006/math" xmlns:v="urn:schemas-microsoft-com:vml" xmlns:wp14="http://schemas.microsoft.com/office/word/2010/wordprocessingDrawing" xmlns:wp="http://schemas.openxmlformats.org/drawingml/2006/wordprocessingDrawing" xmlns:w10="urn:schemas-microsoft-com:office:word" xmlns:w="http://schemas.openxmlformats.org/wordprocessingml/2006/main" xmlns:w14="http://schemas.microsoft.com/office/word/2010/wordml" xmlns:w15="http://schemas.microsoft.com/office/word/2012/wordml" xmlns:w16cei="http://schemas.microsoft.com/office/word/2026/wordml/cei" xmlns:w16cex="http://schemas.microsoft.com/office/word/2018/wordml/cex" xmlns:w16cid="http://schemas.microsoft.com/office/word/2016/wordml/cid" xmlns:w16="http://schemas.microsoft.com/office/word/2018/wordml" xmlns:w16du="http://schemas.microsoft.com/office/word/2023/wordml/word16du" xmlns:w16sdtdh="http://schemas.microsoft.com/office/word/2020/wordml/sdtdatahash" xmlns:w16sdtfl="http://schemas.microsoft.com/office/word/2024/wordml/sdtformatlock" xmlns:w16se="http://schemas.microsoft.com/office/word/2015/wordml/symex" xmlns:wpg="http://schemas.microsoft.com/office/word/2010/wordprocessingGroup" xmlns:wpi="http://schemas.microsoft.com/office/word/2010/wordprocessingInk" xmlns:wne="http://schemas.microsoft.com/office/word/2006/wordml" xmlns:wps="http://schemas.microsoft.com/office/word/2010/wordprocessingShape" mc:Ignorable="w14 w15 w16se w16cid w16 w16cex w16sdtdh w16sdtfl w16du wp14">
   <w:docParts>
     <w:docPart>
       <w:docPartPr>
@@ -13411,7 +13418,7 @@
 </file>
 
 <file path=word/glossary/fontTable.xml><?xml version="1.0" encoding="utf-8"?>
-<w:fonts xmlns:mc="http://schemas.openxmlformats.org/markup-compatibility/2006" xmlns:r="http://schemas.openxmlformats.org/officeDocument/2006/relationships" xmlns:w="http://schemas.openxmlformats.org/wordprocessingml/2006/main" xmlns:w14="http://schemas.microsoft.com/office/word/2010/wordml" xmlns:w15="http://schemas.microsoft.com/office/word/2012/wordml" xmlns:w16cex="http://schemas.microsoft.com/office/word/2018/wordml/cex" xmlns:w16cid="http://schemas.microsoft.com/office/word/2016/wordml/cid" xmlns:w16="http://schemas.microsoft.com/office/word/2018/wordml" xmlns:w16sdtdh="http://schemas.microsoft.com/office/word/2020/wordml/sdtdatahash" xmlns:w16se="http://schemas.microsoft.com/office/word/2015/wordml/symex" mc:Ignorable="w14 w15 w16se w16cid w16 w16cex w16sdtdh">
+<w:fonts xmlns:mc="http://schemas.openxmlformats.org/markup-compatibility/2006" xmlns:r="http://schemas.openxmlformats.org/officeDocument/2006/relationships" xmlns:w="http://schemas.openxmlformats.org/wordprocessingml/2006/main" xmlns:w14="http://schemas.microsoft.com/office/word/2010/wordml" xmlns:w15="http://schemas.microsoft.com/office/word/2012/wordml" xmlns:w16cex="http://schemas.microsoft.com/office/word/2018/wordml/cex" xmlns:w16cid="http://schemas.microsoft.com/office/word/2016/wordml/cid" xmlns:w16="http://schemas.microsoft.com/office/word/2018/wordml" xmlns:w16du="http://schemas.microsoft.com/office/word/2023/wordml/word16du" xmlns:w16sdtdh="http://schemas.microsoft.com/office/word/2020/wordml/sdtdatahash" xmlns:w16sdtfl="http://schemas.microsoft.com/office/word/2024/wordml/sdtformatlock" xmlns:w16se="http://schemas.microsoft.com/office/word/2015/wordml/symex" mc:Ignorable="w14 w15 w16se w16cid w16 w16cex w16sdtdh w16sdtfl w16du">
   <w:font w:name="Symbol">
     <w:panose1 w:val="05050102010706020507"/>
     <w:charset w:val="02"/>
@@ -13458,14 +13465,14 @@
     <w:charset w:val="00"/>
     <w:family w:val="swiss"/>
     <w:pitch w:val="variable"/>
-    <w:sig w:usb0="E4002EFF" w:usb1="C000247B" w:usb2="00000009" w:usb3="00000000" w:csb0="000001FF" w:csb1="00000000"/>
+    <w:sig w:usb0="E4002EFF" w:usb1="C200247B" w:usb2="00000009" w:usb3="00000000" w:csb0="000001FF" w:csb1="00000000"/>
   </w:font>
   <w:font w:name="Calibri Light">
     <w:panose1 w:val="020F0302020204030204"/>
     <w:charset w:val="00"/>
     <w:family w:val="swiss"/>
     <w:pitch w:val="variable"/>
-    <w:sig w:usb0="E4002EFF" w:usb1="C000247B" w:usb2="00000009" w:usb3="00000000" w:csb0="000001FF" w:csb1="00000000"/>
+    <w:sig w:usb0="E4002EFF" w:usb1="C200247B" w:usb2="00000009" w:usb3="00000000" w:csb0="000001FF" w:csb1="00000000"/>
   </w:font>
   <w:font w:name="Cambria">
     <w:panose1 w:val="02040503050406030204"/>
@@ -13496,7 +13503,7 @@
 </file>
 
 <file path=word/glossary/settings.xml><?xml version="1.0" encoding="utf-8"?>
-<w:settings xmlns:mc="http://schemas.openxmlformats.org/markup-compatibility/2006" xmlns:o="urn:schemas-microsoft-com:office:office" xmlns:r="http://schemas.openxmlformats.org/officeDocument/2006/relationships" xmlns:m="http://schemas.openxmlformats.org/officeDocument/2006/math" xmlns:v="urn:schemas-microsoft-com:vml" xmlns:w10="urn:schemas-microsoft-com:office:word" xmlns:w="http://schemas.openxmlformats.org/wordprocessingml/2006/main" xmlns:w14="http://schemas.microsoft.com/office/word/2010/wordml" xmlns:w15="http://schemas.microsoft.com/office/word/2012/wordml" xmlns:w16cex="http://schemas.microsoft.com/office/word/2018/wordml/cex" xmlns:w16cid="http://schemas.microsoft.com/office/word/2016/wordml/cid" xmlns:w16="http://schemas.microsoft.com/office/word/2018/wordml" xmlns:w16sdtdh="http://schemas.microsoft.com/office/word/2020/wordml/sdtdatahash" xmlns:w16se="http://schemas.microsoft.com/office/word/2015/wordml/symex" xmlns:sl="http://schemas.openxmlformats.org/schemaLibrary/2006/main" mc:Ignorable="w14 w15 w16se w16cid w16 w16cex w16sdtdh">
+<w:settings xmlns:mc="http://schemas.openxmlformats.org/markup-compatibility/2006" xmlns:o="urn:schemas-microsoft-com:office:office" xmlns:r="http://schemas.openxmlformats.org/officeDocument/2006/relationships" xmlns:m="http://schemas.openxmlformats.org/officeDocument/2006/math" xmlns:v="urn:schemas-microsoft-com:vml" xmlns:w10="urn:schemas-microsoft-com:office:word" xmlns:w="http://schemas.openxmlformats.org/wordprocessingml/2006/main" xmlns:w14="http://schemas.microsoft.com/office/word/2010/wordml" xmlns:w15="http://schemas.microsoft.com/office/word/2012/wordml" xmlns:w16cex="http://schemas.microsoft.com/office/word/2018/wordml/cex" xmlns:w16cid="http://schemas.microsoft.com/office/word/2016/wordml/cid" xmlns:w16="http://schemas.microsoft.com/office/word/2018/wordml" xmlns:w16du="http://schemas.microsoft.com/office/word/2023/wordml/word16du" xmlns:w16sdtdh="http://schemas.microsoft.com/office/word/2020/wordml/sdtdatahash" xmlns:w16sdtfl="http://schemas.microsoft.com/office/word/2024/wordml/sdtformatlock" xmlns:w16se="http://schemas.microsoft.com/office/word/2015/wordml/symex" xmlns:sl="http://schemas.openxmlformats.org/schemaLibrary/2006/main" mc:Ignorable="w14 w15 w16se w16cid w16 w16cex w16sdtdh w16sdtfl w16du">
   <w:view w:val="normal"/>
   <w:defaultTabStop w:val="708"/>
   <w:hyphenationZone w:val="425"/>
@@ -13513,6 +13520,7 @@
   <w:rsids>
     <w:rsidRoot w:val="00EB68D0"/>
     <w:rsid w:val="000B1A8F"/>
+    <w:rsid w:val="00134196"/>
     <w:rsid w:val="0019100B"/>
     <w:rsid w:val="0025601C"/>
     <w:rsid w:val="00380ABE"/>
@@ -13521,6 +13529,7 @@
     <w:rsid w:val="00486E91"/>
     <w:rsid w:val="004F65C0"/>
     <w:rsid w:val="0056563D"/>
+    <w:rsid w:val="00666356"/>
     <w:rsid w:val="006B3154"/>
     <w:rsid w:val="006F39AD"/>
     <w:rsid w:val="0077505B"/>
@@ -13529,6 +13538,7 @@
     <w:rsid w:val="00B27620"/>
     <w:rsid w:val="00B54FA9"/>
     <w:rsid w:val="00BD68CD"/>
+    <w:rsid w:val="00BF632B"/>
     <w:rsid w:val="00D20280"/>
     <w:rsid w:val="00E96F7E"/>
     <w:rsid w:val="00EB68D0"/>
@@ -13548,14 +13558,14 @@
   </m:mathPr>
   <w:themeFontLang w:val="es-ES"/>
   <w:clrSchemeMapping w:bg1="light1" w:t1="dark1" w:bg2="light2" w:t2="dark2" w:accent1="accent1" w:accent2="accent2" w:accent3="accent3" w:accent4="accent4" w:accent5="accent5" w:accent6="accent6" w:hyperlink="hyperlink" w:followedHyperlink="followedHyperlink"/>
-  <w:decimalSymbol w:val="."/>
-  <w:listSeparator w:val=","/>
+  <w:decimalSymbol w:val=","/>
+  <w:listSeparator w:val=";"/>
   <w15:chartTrackingRefBased/>
 </w:settings>
 </file>
 
 <file path=word/glossary/styles.xml><?xml version="1.0" encoding="utf-8"?>
-<w:styles xmlns:mc="http://schemas.openxmlformats.org/markup-compatibility/2006" xmlns:r="http://schemas.openxmlformats.org/officeDocument/2006/relationships" xmlns:w="http://schemas.openxmlformats.org/wordprocessingml/2006/main" xmlns:w14="http://schemas.microsoft.com/office/word/2010/wordml" xmlns:w15="http://schemas.microsoft.com/office/word/2012/wordml" xmlns:w16cex="http://schemas.microsoft.com/office/word/2018/wordml/cex" xmlns:w16cid="http://schemas.microsoft.com/office/word/2016/wordml/cid" xmlns:w16="http://schemas.microsoft.com/office/word/2018/wordml" xmlns:w16sdtdh="http://schemas.microsoft.com/office/word/2020/wordml/sdtdatahash" xmlns:w16se="http://schemas.microsoft.com/office/word/2015/wordml/symex" mc:Ignorable="w14 w15 w16se w16cid w16 w16cex w16sdtdh">
+<w:styles xmlns:mc="http://schemas.openxmlformats.org/markup-compatibility/2006" xmlns:r="http://schemas.openxmlformats.org/officeDocument/2006/relationships" xmlns:w="http://schemas.openxmlformats.org/wordprocessingml/2006/main" xmlns:w14="http://schemas.microsoft.com/office/word/2010/wordml" xmlns:w15="http://schemas.microsoft.com/office/word/2012/wordml" xmlns:w16cex="http://schemas.microsoft.com/office/word/2018/wordml/cex" xmlns:w16cid="http://schemas.microsoft.com/office/word/2016/wordml/cid" xmlns:w16="http://schemas.microsoft.com/office/word/2018/wordml" xmlns:w16du="http://schemas.microsoft.com/office/word/2023/wordml/word16du" xmlns:w16sdtdh="http://schemas.microsoft.com/office/word/2020/wordml/sdtdatahash" xmlns:w16sdtfl="http://schemas.microsoft.com/office/word/2024/wordml/sdtformatlock" xmlns:w16se="http://schemas.microsoft.com/office/word/2015/wordml/symex" mc:Ignorable="w14 w15 w16se w16cid w16 w16cex w16sdtdh w16sdtfl w16du">
   <w:docDefaults>
     <w:rPrDefault>
       <w:rPr>
@@ -13992,18 +14002,6 @@
       <w:color w:val="666666"/>
     </w:rPr>
   </w:style>
-  <w:style w:type="paragraph" w:customStyle="1" w:styleId="02B84418ECFC4B1AA1AADB02B47A17AC">
-    <w:name w:val="02B84418ECFC4B1AA1AADB02B47A17AC"/>
-    <w:rsid w:val="00EB68D0"/>
-  </w:style>
-  <w:style w:type="paragraph" w:customStyle="1" w:styleId="0BB5E3CEAEE5404F9CEAB702968992E0">
-    <w:name w:val="0BB5E3CEAEE5404F9CEAB702968992E0"/>
-    <w:rsid w:val="00EB68D0"/>
-  </w:style>
-  <w:style w:type="paragraph" w:customStyle="1" w:styleId="C6D44289A5D94B5C88A1C13EE80E0D06">
-    <w:name w:val="C6D44289A5D94B5C88A1C13EE80E0D06"/>
-    <w:rsid w:val="00EB68D0"/>
-  </w:style>
   <w:style w:type="paragraph" w:customStyle="1" w:styleId="13126397807E46FDA154F4E5744DD510">
     <w:name w:val="13126397807E46FDA154F4E5744DD510"/>
     <w:rsid w:val="0081531B"/>
@@ -14029,7 +14027,7 @@
 </file>
 
 <file path=word/glossary/webSettings.xml><?xml version="1.0" encoding="utf-8"?>
-<w:webSettings xmlns:mc="http://schemas.openxmlformats.org/markup-compatibility/2006" xmlns:r="http://schemas.openxmlformats.org/officeDocument/2006/relationships" xmlns:w="http://schemas.openxmlformats.org/wordprocessingml/2006/main" xmlns:w14="http://schemas.microsoft.com/office/word/2010/wordml" xmlns:w15="http://schemas.microsoft.com/office/word/2012/wordml" xmlns:w16cex="http://schemas.microsoft.com/office/word/2018/wordml/cex" xmlns:w16cid="http://schemas.microsoft.com/office/word/2016/wordml/cid" xmlns:w16="http://schemas.microsoft.com/office/word/2018/wordml" xmlns:w16sdtdh="http://schemas.microsoft.com/office/word/2020/wordml/sdtdatahash" xmlns:w16se="http://schemas.microsoft.com/office/word/2015/wordml/symex" mc:Ignorable="w14 w15 w16se w16cid w16 w16cex w16sdtdh">
+<w:webSettings xmlns:mc="http://schemas.openxmlformats.org/markup-compatibility/2006" xmlns:r="http://schemas.openxmlformats.org/officeDocument/2006/relationships" xmlns:w="http://schemas.openxmlformats.org/wordprocessingml/2006/main" xmlns:w14="http://schemas.microsoft.com/office/word/2010/wordml" xmlns:w15="http://schemas.microsoft.com/office/word/2012/wordml" xmlns:w16cex="http://schemas.microsoft.com/office/word/2018/wordml/cex" xmlns:w16cid="http://schemas.microsoft.com/office/word/2016/wordml/cid" xmlns:w16="http://schemas.microsoft.com/office/word/2018/wordml" xmlns:w16du="http://schemas.microsoft.com/office/word/2023/wordml/word16du" xmlns:w16sdtdh="http://schemas.microsoft.com/office/word/2020/wordml/sdtdatahash" xmlns:w16sdtfl="http://schemas.microsoft.com/office/word/2024/wordml/sdtformatlock" xmlns:w16se="http://schemas.microsoft.com/office/word/2015/wordml/symex" mc:Ignorable="w14 w15 w16se w16cid w16 w16cex w16sdtdh w16sdtfl w16du">
   <w:optimizeForBrowser/>
   <w:allowPNG/>
 </w:webSettings>

</xml_diff>